<commit_message>
BA Part 4 (Manual): sync with current Part 2-3, one action per When, fixed 5 Whys chain, Olena is 58
Co-Authored-By: Claude Opus 5.5 <noreply@anthropic.com>
</commit_message>
<xml_diff>
--- a/BA/Part 4_Requirements Documentation-20260912/Done/Manual/Artifacts/1. User Stories_VNS.docx
+++ b/BA/Part 4_Requirements Documentation-20260912/Done/Manual/Artifacts/1. User Stories_VNS.docx
@@ -302,7 +302,7 @@
           <w:sz w:val="24"/>
           <w:szCs w:val="24"/>
         </w:rPr>
-        <w:t xml:space="preserve"> the lecturer has enabled AI summaries for this course</w:t>
+        <w:t xml:space="preserve"> the lecturer has switched on AI summaries for this course</w:t>
       </w:r>
     </w:p>
     <w:p>
@@ -915,7 +915,37 @@
           <w:sz w:val="24"/>
           <w:szCs w:val="24"/>
         </w:rPr>
-        <w:t xml:space="preserve"> the lecturer has enabled questions to AI for this course</w:t>
+        <w:t xml:space="preserve"> the lecturer has switched on questions to AI for this course</w:t>
+      </w:r>
+    </w:p>
+    <w:p>
+      <w:pPr>
+        <w:keepNext/>
+        <w:spacing w:after="60"/>
+        <w:ind w:firstLine="720"/>
+        <w:rPr>
+          <w:rFonts w:ascii="Times New Roman" w:hAnsi="Times New Roman" w:cs="Times New Roman"/>
+          <w:sz w:val="24"/>
+          <w:szCs w:val="24"/>
+        </w:rPr>
+      </w:pPr>
+      <w:r>
+        <w:rPr>
+          <w:rFonts w:ascii="Times New Roman" w:hAnsi="Times New Roman" w:cs="Times New Roman"/>
+          <w:b/>
+          <w:bCs/>
+          <w:sz w:val="24"/>
+          <w:szCs w:val="24"/>
+        </w:rPr>
+        <w:t xml:space="preserve">And</w:t>
+      </w:r>
+      <w:r>
+        <w:rPr>
+          <w:rFonts w:ascii="Times New Roman" w:hAnsi="Times New Roman" w:cs="Times New Roman"/>
+          <w:sz w:val="24"/>
+          <w:szCs w:val="24"/>
+        </w:rPr>
+        <w:t xml:space="preserve"> Student has typed “Why does BFS use a queue?” in the “Ask a question about this lecture” field</w:t>
       </w:r>
     </w:p>
     <w:p>
@@ -944,7 +974,7 @@
           <w:sz w:val="24"/>
           <w:szCs w:val="24"/>
         </w:rPr>
-        <w:t xml:space="preserve"> Student types the question “Why does BFS use a queue?” in the “Ask a question about this lecture” field and presses “Go”</w:t>
+        <w:t xml:space="preserve"> Student presses “Go”</w:t>
       </w:r>
     </w:p>
     <w:p>
@@ -1205,7 +1235,7 @@
           <w:sz w:val="24"/>
           <w:szCs w:val="24"/>
         </w:rPr>
-        <w:t xml:space="preserve"> System offers a button that copies the question to the #questions channel of the course</w:t>
+        <w:t xml:space="preserve"> System offers the “Ask the group” button that copies the question to the “Course Q&amp;A” of the course</w:t>
       </w:r>
     </w:p>
     <w:p>
@@ -1349,7 +1379,7 @@
           <w:sz w:val="24"/>
           <w:szCs w:val="24"/>
         </w:rPr>
-        <w:t xml:space="preserve"> System offers to explain the theory from the lectures that Lab 2 is based on</w:t>
+        <w:t xml:space="preserve"> System offers hints and explanations of the theory from the lectures that Lab 2 is based on</w:t>
       </w:r>
     </w:p>
     <w:p>
@@ -1622,6 +1652,8 @@
     </w:p>
     <w:p>
       <w:pPr>
+        <w:keepNext/>
+        <w:spacing w:after="60"/>
         <w:rPr>
           <w:rFonts w:ascii="Times New Roman" w:hAnsi="Times New Roman" w:cs="Times New Roman"/>
           <w:sz w:val="24"/>
@@ -1649,6 +1681,34 @@
     </w:p>
     <w:p>
       <w:pPr>
+        <w:ind w:firstLine="720"/>
+        <w:rPr>
+          <w:rFonts w:ascii="Times New Roman" w:hAnsi="Times New Roman" w:cs="Times New Roman"/>
+          <w:sz w:val="24"/>
+          <w:szCs w:val="24"/>
+        </w:rPr>
+      </w:pPr>
+      <w:r>
+        <w:rPr>
+          <w:rFonts w:ascii="Times New Roman" w:hAnsi="Times New Roman" w:cs="Times New Roman"/>
+          <w:b/>
+          <w:bCs/>
+          <w:sz w:val="24"/>
+          <w:szCs w:val="24"/>
+        </w:rPr>
+        <w:t xml:space="preserve">And</w:t>
+      </w:r>
+      <w:r>
+        <w:rPr>
+          <w:rFonts w:ascii="Times New Roman" w:hAnsi="Times New Roman" w:cs="Times New Roman"/>
+          <w:sz w:val="24"/>
+          <w:szCs w:val="24"/>
+        </w:rPr>
+        <w:t xml:space="preserve"> all three switches are off until the lecturer turns them on</w:t>
+      </w:r>
+    </w:p>
+    <w:p>
+      <w:pPr>
         <w:keepNext/>
         <w:rPr>
           <w:rFonts w:ascii="Times New Roman" w:hAnsi="Times New Roman" w:cs="Times New Roman"/>
@@ -1673,7 +1733,7 @@
           <w:sz w:val="24"/>
           <w:szCs w:val="24"/>
         </w:rPr>
-        <w:t xml:space="preserve"> Turn off an AI feature</w:t>
+        <w:t xml:space="preserve"> Turn on one AI feature</w:t>
       </w:r>
     </w:p>
     <w:p>
@@ -1709,6 +1769,36 @@
       <w:pPr>
         <w:keepNext/>
         <w:spacing w:after="60"/>
+        <w:ind w:firstLine="720"/>
+        <w:rPr>
+          <w:rFonts w:ascii="Times New Roman" w:hAnsi="Times New Roman" w:cs="Times New Roman"/>
+          <w:sz w:val="24"/>
+          <w:szCs w:val="24"/>
+        </w:rPr>
+      </w:pPr>
+      <w:r>
+        <w:rPr>
+          <w:rFonts w:ascii="Times New Roman" w:hAnsi="Times New Roman" w:cs="Times New Roman"/>
+          <w:b/>
+          <w:bCs/>
+          <w:sz w:val="24"/>
+          <w:szCs w:val="24"/>
+        </w:rPr>
+        <w:t xml:space="preserve">And</w:t>
+      </w:r>
+      <w:r>
+        <w:rPr>
+          <w:rFonts w:ascii="Times New Roman" w:hAnsi="Times New Roman" w:cs="Times New Roman"/>
+          <w:sz w:val="24"/>
+          <w:szCs w:val="24"/>
+        </w:rPr>
+        <w:t xml:space="preserve"> Lecturer has turned on “Summaries” only</w:t>
+      </w:r>
+    </w:p>
+    <w:p>
+      <w:pPr>
+        <w:keepNext/>
+        <w:spacing w:after="60"/>
         <w:rPr>
           <w:rFonts w:ascii="Times New Roman" w:hAnsi="Times New Roman" w:cs="Times New Roman"/>
           <w:sz w:val="24"/>
@@ -1731,7 +1821,7 @@
           <w:sz w:val="24"/>
           <w:szCs w:val="24"/>
         </w:rPr>
-        <w:t xml:space="preserve"> Lecturer turns off “Questions to AI” and presses “Save”</w:t>
+        <w:t xml:space="preserve"> Lecturer presses “Save”</w:t>
       </w:r>
     </w:p>
     <w:p>
@@ -1790,7 +1880,7 @@
           <w:sz w:val="24"/>
           <w:szCs w:val="24"/>
         </w:rPr>
-        <w:t xml:space="preserve"> students of the course no longer see the “Ask AI” tab and the question field on the lecture pages</w:t>
+        <w:t xml:space="preserve"> students of the course see the “AI summary” tab on the lecture pages</w:t>
       </w:r>
     </w:p>
     <w:p>
@@ -1818,7 +1908,7 @@
           <w:sz w:val="24"/>
           <w:szCs w:val="24"/>
         </w:rPr>
-        <w:t xml:space="preserve"> the other AI features of the course stay available</w:t>
+        <w:t xml:space="preserve"> students do not see the “Ask a question about this lecture” field</w:t>
       </w:r>
     </w:p>
     <w:p>

</xml_diff>